<commit_message>
Update education analysis scripts and outputs for Romania four-county pilot
- Modified `EDUCATION_20261004_romania_four_county_pilot.py` to include new percentile cut settings for examination scores, enhancing the analysis of educational placements.
- Updated the Jupyter notebook `EDUCATION_20261004_Romania_2001_four_county_descriptive_pilot.ipynb` to reflect the new percentile boundaries and improve output clarity.
- Added new CSV outputs for conditional bins and hero bins, providing detailed insights into applicant performance across counties.
- Introduced new visualizations for county and pooled bands, enhancing the interpretability of the analysis results.

These changes improve the functionality and clarity of the education analysis framework, supporting ongoing research initiatives.
</commit_message>
<xml_diff>
--- a/3-Master_Plan/VECTOR_work/new_VECTOR_work/Model_Chapter_Working_Outline.docx
+++ b/3-Master_Plan/VECTOR_work/new_VECTOR_work/Model_Chapter_Working_Outline.docx
@@ -23,7 +23,7 @@
         </w:numPr>
       </w:pPr>
       <w:r>
-        <w:t>The question and the three-stage architecture</w:t>
+        <w:t>The problem the model is built to explain</w:t>
       </w:r>
     </w:p>
     <w:p>
@@ -35,7 +35,7 @@
         </w:numPr>
       </w:pPr>
       <w:r>
-        <w:t>Central distinction: being in a strong group and receiving a scarce distinction are different events.</w:t>
+        <w:t>Why strong environments do not always produce greater success. Begin with the empirical intuition that stronger groups often appear advantageous, then introduce the empirical complication that greater peer quality does not always correspond to uniformly greater later success.</w:t>
       </w:r>
     </w:p>
     <w:p>
@@ -47,7 +47,7 @@
         </w:numPr>
       </w:pPr>
       <w:r>
-        <w:t>ASSIGN: explain who ends up with whom and how assignment creates peer environments.</w:t>
+        <w:t>Separating environmental effects from later selection. Explain why the quality of an individual's environment and the process through which that individual is later evaluated or selected must be modeled separately.</w:t>
       </w:r>
     </w:p>
     <w:p>
@@ -59,7 +59,7 @@
         </w:numPr>
       </w:pPr>
       <w:r>
-        <w:t>SCORE: explain how the specified environment enters an individual’s modeled score.</w:t>
+        <w:t>A simple organizational example. Walk the reader through an individual entering with measurable characteristics and prior performance, developing alongside peers, being evaluated over time, and eventually facing a later selection decision.</w:t>
       </w:r>
     </w:p>
     <w:p>
@@ -71,7 +71,19 @@
         </w:numPr>
       </w:pPr>
       <w:r>
-        <w:t>SELECT: explain how scores become outcomes under an opportunity limit or probability rule.</w:t>
+        <w:t>The three-stage architecture: ASSIGN, SCORE, and SELECT. Preview how assignment creates the peer environment, scoring represents how that environment enters competitive standing, and selection converts scores into outcomes.</w:t>
+      </w:r>
+    </w:p>
+    <w:p>
+      <w:pPr>
+        <w:pStyle w:val="Heading1"/>
+        <w:numPr>
+          <w:ilvl w:val="1"/>
+          <w:numId w:val="12"/>
+        </w:numPr>
+      </w:pPr>
+      <w:r>
+        <w:t>Individuals, groups, and peer environments</w:t>
       </w:r>
     </w:p>
     <w:p>
@@ -83,7 +95,7 @@
         </w:numPr>
       </w:pPr>
       <w:r>
-        <w:t>Use a small verbal example to motivate the three stages. Distinguish the environmental benefits-minus-drawbacks idea from an advancement probability.</w:t>
+        <w:t>The individual entering the model. Define the individual input Aᵢ, the relevant population, and the time unit. Explain that observed performance is a measured characteristic, not automatically innate or portable talent.</w:t>
       </w:r>
     </w:p>
     <w:p>
@@ -95,19 +107,7 @@
         </w:numPr>
       </w:pPr>
       <w:r>
-        <w:t>What the model is trying to explain—and what it is not</w:t>
-      </w:r>
-    </w:p>
-    <w:p>
-      <w:pPr>
-        <w:pStyle w:val="Heading1"/>
-        <w:numPr>
-          <w:ilvl w:val="1"/>
-          <w:numId w:val="12"/>
-        </w:numPr>
-      </w:pPr>
-      <w:r>
-        <w:t xml:space="preserve"> What the model treats as individual performance and environment</w:t>
+        <w:t>The group as the individual's environment. Explain group membership, group size, capacity, and why the group's composition is an analytically distinct feature of the individual's setting.</w:t>
       </w:r>
     </w:p>
     <w:p>
@@ -119,7 +119,7 @@
         </w:numPr>
       </w:pPr>
       <w:r>
-        <w:t>Define the individual input Aᵢ, the population, and the time unit. Observed performance is not automatically innate or portable talent.</w:t>
+        <w:t>Measuring peer quality. Define leave-one-out mean peer performance and explain why the focal individual is excluded when describing the peer environment.</w:t>
       </w:r>
     </w:p>
     <w:p>
@@ -131,7 +131,7 @@
         </w:numPr>
       </w:pPr>
       <w:r>
-        <w:t>Explain the performance measure, standardization, group membership, group size, and capacity.</w:t>
+        <w:t>Peer quality is not the same as congestion. Distinguish the descriptive peer-quality quantity used to characterize or plot the environment from the congestion quantity that enters the modeled score.</w:t>
       </w:r>
     </w:p>
     <w:p>
@@ -143,19 +143,7 @@
         </w:numPr>
       </w:pPr>
       <w:r>
-        <w:t>Define mean peer performance excluding the focal individual. Distinguish this plotting quantity from the congestion quantity subtracted from the score.</w:t>
-      </w:r>
-    </w:p>
-    <w:p>
-      <w:pPr>
-        <w:pStyle w:val="ListBullet"/>
-        <w:numPr>
-          <w:ilvl w:val="2"/>
-          <w:numId w:val="12"/>
-        </w:numPr>
-      </w:pPr>
-      <w:r>
-        <w:t>Explain the recent basketball example: assignments changed while standardized season points per minute remained fixed. This does not reconstruct performance on another team.</w:t>
+        <w:t>A concrete example from basketball. Explain that assignments can change while standardized season points per minute remains fixed; this isolates the modeled assignment/environment mechanism and does not reconstruct how a player's performance would have changed on another team.</w:t>
       </w:r>
     </w:p>
     <w:p>
@@ -387,10 +375,7 @@
         </w:numPr>
       </w:pPr>
       <w:r>
-        <w:t xml:space="preserve"> </w:t>
-      </w:r>
-      <w:r>
-        <w:t>4.6. Parameter regimes: what each knob actually does</w:t>
+        <w:t>Parameter regimes: what each knob actually does</w:t>
       </w:r>
     </w:p>
     <w:p>

</xml_diff>